<commit_message>
Apply Decision Register v1.1, trials from BD registration, Lawfecta branding, site-unchanged setup
Co-Authored-By: Claude Opus 5.5 <noreply@anthropic.com>
Claude-Session: https://claude.ai/code/session_01Bbbjf8CG5AqkK7i31P64qu
</commit_message>
<xml_diff>
--- a/docs/Decision_Sheet.docx
+++ b/docs/Decision_Sheet.docx
@@ -16,7 +16,7 @@
         <w:pStyle w:val="FirstParagraph"/>
       </w:pPr>
       <w:r>
-        <w:t xml:space="preserve">Version DS-1.0-draft, updated 2026-10-26. Built from config/decisions.json.</w:t>
+        <w:t xml:space="preserve">Version DS-1.1, updated 2026-10-26. Built from config/decisions.json.</w:t>
       </w:r>
     </w:p>
     <w:p>
@@ -277,7 +277,7 @@
               <w:jc w:val="left"/>
             </w:pPr>
             <w:r>
-              <w:t xml:space="preserve">Suggested</w:t>
+              <w:t xml:space="preserve">Confirmed</w:t>
             </w:r>
           </w:p>
         </w:tc>
@@ -347,7 +347,7 @@
               <w:jc w:val="left"/>
             </w:pPr>
             <w:r>
-              <w:t xml:space="preserve">Suggested</w:t>
+              <w:t xml:space="preserve">Confirmed</w:t>
             </w:r>
           </w:p>
         </w:tc>
@@ -417,7 +417,7 @@
               <w:jc w:val="left"/>
             </w:pPr>
             <w:r>
-              <w:t xml:space="preserve">Suggested</w:t>
+              <w:t xml:space="preserve">Confirmed</w:t>
             </w:r>
           </w:p>
         </w:tc>
@@ -487,7 +487,7 @@
               <w:jc w:val="left"/>
             </w:pPr>
             <w:r>
-              <w:t xml:space="preserve">Suggested</w:t>
+              <w:t xml:space="preserve">Confirmed</w:t>
             </w:r>
           </w:p>
         </w:tc>
@@ -510,7 +510,7 @@
         <w:pStyle w:val="Compact"/>
       </w:pPr>
       <w:r>
-        <w:t xml:space="preserve">Yearly prices: Yearly price is 10 times the monthly price (two months free). Status: Open. Your decision: ______</w:t>
+        <w:t xml:space="preserve">Yearly prices: Yearly price is 10 times the monthly price (two months free). Status: Confirmed. Your decision: ______</w:t>
       </w:r>
     </w:p>
     <w:bookmarkEnd w:id="20"/>
@@ -706,7 +706,7 @@
               <w:jc w:val="left"/>
             </w:pPr>
             <w:r>
-              <w:t xml:space="preserve">Open</w:t>
+              <w:t xml:space="preserve">Confirmed</w:t>
             </w:r>
           </w:p>
         </w:tc>
@@ -740,30 +740,6 @@
               <w:jc w:val="left"/>
             </w:pPr>
             <w:r>
-              <w:t xml:space="preserve">5</w:t>
-            </w:r>
-          </w:p>
-        </w:tc>
-        <w:tc>
-          <w:tcPr/>
-          <w:p>
-            <w:pPr>
-              <w:pStyle w:val="Compact"/>
-              <w:jc w:val="left"/>
-            </w:pPr>
-            <w:r>
-              <w:t xml:space="preserve">25</w:t>
-            </w:r>
-          </w:p>
-        </w:tc>
-        <w:tc>
-          <w:tcPr/>
-          <w:p>
-            <w:pPr>
-              <w:pStyle w:val="Compact"/>
-              <w:jc w:val="left"/>
-            </w:pPr>
-            <w:r>
               <w:t xml:space="preserve">No cap</w:t>
             </w:r>
           </w:p>
@@ -788,7 +764,31 @@
               <w:jc w:val="left"/>
             </w:pPr>
             <w:r>
-              <w:t xml:space="preserve">Open</w:t>
+              <w:t xml:space="preserve">No cap</w:t>
+            </w:r>
+          </w:p>
+        </w:tc>
+        <w:tc>
+          <w:tcPr/>
+          <w:p>
+            <w:pPr>
+              <w:pStyle w:val="Compact"/>
+              <w:jc w:val="left"/>
+            </w:pPr>
+            <w:r>
+              <w:t xml:space="preserve">No cap</w:t>
+            </w:r>
+          </w:p>
+        </w:tc>
+        <w:tc>
+          <w:tcPr/>
+          <w:p>
+            <w:pPr>
+              <w:pStyle w:val="Compact"/>
+              <w:jc w:val="left"/>
+            </w:pPr>
+            <w:r>
+              <w:t xml:space="preserve">Confirmed</w:t>
             </w:r>
           </w:p>
         </w:tc>
@@ -870,7 +870,7 @@
               <w:jc w:val="left"/>
             </w:pPr>
             <w:r>
-              <w:t xml:space="preserve">Open</w:t>
+              <w:t xml:space="preserve">Confirmed</w:t>
             </w:r>
           </w:p>
         </w:tc>
@@ -884,6 +884,30 @@
         </w:tc>
       </w:tr>
     </w:tbl>
+    <w:p>
+      <w:pPr>
+        <w:numPr>
+          <w:ilvl w:val="0"/>
+          <w:numId w:val="1003"/>
+        </w:numPr>
+        <w:pStyle w:val="Compact"/>
+      </w:pPr>
+      <w:r>
+        <w:t xml:space="preserve">Open Flex Gigs at one time: No numerical cap still keeps anti-spam and security safeguards.</w:t>
+      </w:r>
+    </w:p>
+    <w:p>
+      <w:pPr>
+        <w:numPr>
+          <w:ilvl w:val="0"/>
+          <w:numId w:val="1003"/>
+        </w:numPr>
+        <w:pStyle w:val="Compact"/>
+      </w:pPr>
+      <w:r>
+        <w:t xml:space="preserve">Team seats included: Business includes three seats, owner included. Extra seats are $15 a month each.</w:t>
+      </w:r>
+    </w:p>
     <w:bookmarkEnd w:id="21"/>
     <w:bookmarkStart w:id="22" w:name="freelancer-side"/>
     <w:p>
@@ -1102,6 +1126,100 @@
               <w:jc w:val="left"/>
             </w:pPr>
             <w:r>
+              <w:t xml:space="preserve">3</w:t>
+            </w:r>
+          </w:p>
+        </w:tc>
+        <w:tc>
+          <w:tcPr/>
+          <w:p>
+            <w:pPr>
+              <w:pStyle w:val="Compact"/>
+              <w:jc w:val="left"/>
+            </w:pPr>
+            <w:r>
+              <w:t xml:space="preserve">5</w:t>
+            </w:r>
+          </w:p>
+        </w:tc>
+        <w:tc>
+          <w:tcPr/>
+          <w:p>
+            <w:pPr>
+              <w:pStyle w:val="Compact"/>
+              <w:jc w:val="left"/>
+            </w:pPr>
+            <w:r>
+              <w:t xml:space="preserve">10</w:t>
+            </w:r>
+          </w:p>
+        </w:tc>
+        <w:tc>
+          <w:tcPr/>
+          <w:p>
+            <w:pPr>
+              <w:pStyle w:val="Compact"/>
+              <w:jc w:val="left"/>
+            </w:pPr>
+            <w:r>
+              <w:t xml:space="preserve">No cap</w:t>
+            </w:r>
+          </w:p>
+        </w:tc>
+        <w:tc>
+          <w:tcPr/>
+          <w:p>
+            <w:pPr>
+              <w:pStyle w:val="Compact"/>
+              <w:jc w:val="left"/>
+            </w:pPr>
+            <w:r>
+              <w:t xml:space="preserve">Open</w:t>
+            </w:r>
+          </w:p>
+        </w:tc>
+        <w:tc>
+          <w:tcPr/>
+          <w:p>
+            <w:pPr>
+              <w:pStyle w:val="Compact"/>
+            </w:pPr>
+          </w:p>
+        </w:tc>
+      </w:tr>
+      <w:tr>
+        <w:tc>
+          <w:tcPr/>
+          <w:p>
+            <w:pPr>
+              <w:pStyle w:val="Compact"/>
+              <w:jc w:val="left"/>
+            </w:pPr>
+            <w:r>
+              <w:t xml:space="preserve">Running promotions at one time</w:t>
+            </w:r>
+          </w:p>
+        </w:tc>
+        <w:tc>
+          <w:tcPr/>
+          <w:p>
+            <w:pPr>
+              <w:pStyle w:val="Compact"/>
+              <w:jc w:val="left"/>
+            </w:pPr>
+            <w:r>
+              <w:t xml:space="preserve">0</w:t>
+            </w:r>
+          </w:p>
+        </w:tc>
+        <w:tc>
+          <w:tcPr/>
+          <w:p>
+            <w:pPr>
+              <w:pStyle w:val="Compact"/>
+              <w:jc w:val="left"/>
+            </w:pPr>
+            <w:r>
               <w:t xml:space="preserve">1</w:t>
             </w:r>
           </w:p>
@@ -1126,6 +1244,64 @@
               <w:jc w:val="left"/>
             </w:pPr>
             <w:r>
+              <w:t xml:space="preserve">No cap</w:t>
+            </w:r>
+          </w:p>
+        </w:tc>
+        <w:tc>
+          <w:tcPr/>
+          <w:p>
+            <w:pPr>
+              <w:pStyle w:val="Compact"/>
+              <w:jc w:val="left"/>
+            </w:pPr>
+            <w:r>
+              <w:t xml:space="preserve">Confirmed</w:t>
+            </w:r>
+          </w:p>
+        </w:tc>
+        <w:tc>
+          <w:tcPr/>
+          <w:p>
+            <w:pPr>
+              <w:pStyle w:val="Compact"/>
+            </w:pPr>
+          </w:p>
+        </w:tc>
+      </w:tr>
+      <w:tr>
+        <w:tc>
+          <w:tcPr/>
+          <w:p>
+            <w:pPr>
+              <w:pStyle w:val="Compact"/>
+              <w:jc w:val="left"/>
+            </w:pPr>
+            <w:r>
+              <w:t xml:space="preserve">Approved pitches to attorneys per month (per month)</w:t>
+            </w:r>
+          </w:p>
+        </w:tc>
+        <w:tc>
+          <w:tcPr/>
+          <w:p>
+            <w:pPr>
+              <w:pStyle w:val="Compact"/>
+              <w:jc w:val="left"/>
+            </w:pPr>
+            <w:r>
+              <w:t xml:space="preserve">3</w:t>
+            </w:r>
+          </w:p>
+        </w:tc>
+        <w:tc>
+          <w:tcPr/>
+          <w:p>
+            <w:pPr>
+              <w:pStyle w:val="Compact"/>
+              <w:jc w:val="left"/>
+            </w:pPr>
+            <w:r>
               <w:t xml:space="preserve">10</w:t>
             </w:r>
           </w:p>
@@ -1138,53 +1314,53 @@
               <w:jc w:val="left"/>
             </w:pPr>
             <w:r>
-              <w:t xml:space="preserve">No cap</w:t>
-            </w:r>
-          </w:p>
-        </w:tc>
-        <w:tc>
-          <w:tcPr/>
-          <w:p>
-            <w:pPr>
-              <w:pStyle w:val="Compact"/>
-              <w:jc w:val="left"/>
-            </w:pPr>
-            <w:r>
-              <w:t xml:space="preserve">Open</w:t>
-            </w:r>
-          </w:p>
-        </w:tc>
-        <w:tc>
-          <w:tcPr/>
-          <w:p>
-            <w:pPr>
-              <w:pStyle w:val="Compact"/>
-            </w:pPr>
-          </w:p>
-        </w:tc>
-      </w:tr>
-      <w:tr>
-        <w:tc>
-          <w:tcPr/>
-          <w:p>
-            <w:pPr>
-              <w:pStyle w:val="Compact"/>
-              <w:jc w:val="left"/>
-            </w:pPr>
-            <w:r>
-              <w:t xml:space="preserve">Running promotions at one time</w:t>
-            </w:r>
-          </w:p>
-        </w:tc>
-        <w:tc>
-          <w:tcPr/>
-          <w:p>
-            <w:pPr>
-              <w:pStyle w:val="Compact"/>
-              <w:jc w:val="left"/>
-            </w:pPr>
-            <w:r>
-              <w:t xml:space="preserve">0</w:t>
+              <w:t xml:space="preserve">25</w:t>
+            </w:r>
+          </w:p>
+        </w:tc>
+        <w:tc>
+          <w:tcPr/>
+          <w:p>
+            <w:pPr>
+              <w:pStyle w:val="Compact"/>
+              <w:jc w:val="left"/>
+            </w:pPr>
+            <w:r>
+              <w:t xml:space="preserve">100</w:t>
+            </w:r>
+          </w:p>
+        </w:tc>
+        <w:tc>
+          <w:tcPr/>
+          <w:p>
+            <w:pPr>
+              <w:pStyle w:val="Compact"/>
+              <w:jc w:val="left"/>
+            </w:pPr>
+            <w:r>
+              <w:t xml:space="preserve">Confirmed</w:t>
+            </w:r>
+          </w:p>
+        </w:tc>
+        <w:tc>
+          <w:tcPr/>
+          <w:p>
+            <w:pPr>
+              <w:pStyle w:val="Compact"/>
+            </w:pPr>
+          </w:p>
+        </w:tc>
+      </w:tr>
+      <w:tr>
+        <w:tc>
+          <w:tcPr/>
+          <w:p>
+            <w:pPr>
+              <w:pStyle w:val="Compact"/>
+              <w:jc w:val="left"/>
+            </w:pPr>
+            <w:r>
+              <w:t xml:space="preserve">Agency team seats included</w:t>
             </w:r>
           </w:p>
         </w:tc>
@@ -1208,6 +1384,30 @@
               <w:jc w:val="left"/>
             </w:pPr>
             <w:r>
+              <w:t xml:space="preserve">1</w:t>
+            </w:r>
+          </w:p>
+        </w:tc>
+        <w:tc>
+          <w:tcPr/>
+          <w:p>
+            <w:pPr>
+              <w:pStyle w:val="Compact"/>
+              <w:jc w:val="left"/>
+            </w:pPr>
+            <w:r>
+              <w:t xml:space="preserve">1</w:t>
+            </w:r>
+          </w:p>
+        </w:tc>
+        <w:tc>
+          <w:tcPr/>
+          <w:p>
+            <w:pPr>
+              <w:pStyle w:val="Compact"/>
+              <w:jc w:val="left"/>
+            </w:pPr>
+            <w:r>
               <w:t xml:space="preserve">3</w:t>
             </w:r>
           </w:p>
@@ -1220,183 +1420,7 @@
               <w:jc w:val="left"/>
             </w:pPr>
             <w:r>
-              <w:t xml:space="preserve">No cap</w:t>
-            </w:r>
-          </w:p>
-        </w:tc>
-        <w:tc>
-          <w:tcPr/>
-          <w:p>
-            <w:pPr>
-              <w:pStyle w:val="Compact"/>
-              <w:jc w:val="left"/>
-            </w:pPr>
-            <w:r>
-              <w:t xml:space="preserve">Open</w:t>
-            </w:r>
-          </w:p>
-        </w:tc>
-        <w:tc>
-          <w:tcPr/>
-          <w:p>
-            <w:pPr>
-              <w:pStyle w:val="Compact"/>
-            </w:pPr>
-          </w:p>
-        </w:tc>
-      </w:tr>
-      <w:tr>
-        <w:tc>
-          <w:tcPr/>
-          <w:p>
-            <w:pPr>
-              <w:pStyle w:val="Compact"/>
-              <w:jc w:val="left"/>
-            </w:pPr>
-            <w:r>
-              <w:t xml:space="preserve">Approved pitches to attorneys per month (per month)</w:t>
-            </w:r>
-          </w:p>
-        </w:tc>
-        <w:tc>
-          <w:tcPr/>
-          <w:p>
-            <w:pPr>
-              <w:pStyle w:val="Compact"/>
-              <w:jc w:val="left"/>
-            </w:pPr>
-            <w:r>
-              <w:t xml:space="preserve">3</w:t>
-            </w:r>
-          </w:p>
-        </w:tc>
-        <w:tc>
-          <w:tcPr/>
-          <w:p>
-            <w:pPr>
-              <w:pStyle w:val="Compact"/>
-              <w:jc w:val="left"/>
-            </w:pPr>
-            <w:r>
-              <w:t xml:space="preserve">10</w:t>
-            </w:r>
-          </w:p>
-        </w:tc>
-        <w:tc>
-          <w:tcPr/>
-          <w:p>
-            <w:pPr>
-              <w:pStyle w:val="Compact"/>
-              <w:jc w:val="left"/>
-            </w:pPr>
-            <w:r>
-              <w:t xml:space="preserve">25</w:t>
-            </w:r>
-          </w:p>
-        </w:tc>
-        <w:tc>
-          <w:tcPr/>
-          <w:p>
-            <w:pPr>
-              <w:pStyle w:val="Compact"/>
-              <w:jc w:val="left"/>
-            </w:pPr>
-            <w:r>
-              <w:t xml:space="preserve">100</w:t>
-            </w:r>
-          </w:p>
-        </w:tc>
-        <w:tc>
-          <w:tcPr/>
-          <w:p>
-            <w:pPr>
-              <w:pStyle w:val="Compact"/>
-              <w:jc w:val="left"/>
-            </w:pPr>
-            <w:r>
-              <w:t xml:space="preserve">Open</w:t>
-            </w:r>
-          </w:p>
-        </w:tc>
-        <w:tc>
-          <w:tcPr/>
-          <w:p>
-            <w:pPr>
-              <w:pStyle w:val="Compact"/>
-            </w:pPr>
-          </w:p>
-        </w:tc>
-      </w:tr>
-      <w:tr>
-        <w:tc>
-          <w:tcPr/>
-          <w:p>
-            <w:pPr>
-              <w:pStyle w:val="Compact"/>
-              <w:jc w:val="left"/>
-            </w:pPr>
-            <w:r>
-              <w:t xml:space="preserve">Agency team seats included</w:t>
-            </w:r>
-          </w:p>
-        </w:tc>
-        <w:tc>
-          <w:tcPr/>
-          <w:p>
-            <w:pPr>
-              <w:pStyle w:val="Compact"/>
-              <w:jc w:val="left"/>
-            </w:pPr>
-            <w:r>
-              <w:t xml:space="preserve">1</w:t>
-            </w:r>
-          </w:p>
-        </w:tc>
-        <w:tc>
-          <w:tcPr/>
-          <w:p>
-            <w:pPr>
-              <w:pStyle w:val="Compact"/>
-              <w:jc w:val="left"/>
-            </w:pPr>
-            <w:r>
-              <w:t xml:space="preserve">1</w:t>
-            </w:r>
-          </w:p>
-        </w:tc>
-        <w:tc>
-          <w:tcPr/>
-          <w:p>
-            <w:pPr>
-              <w:pStyle w:val="Compact"/>
-              <w:jc w:val="left"/>
-            </w:pPr>
-            <w:r>
-              <w:t xml:space="preserve">1</w:t>
-            </w:r>
-          </w:p>
-        </w:tc>
-        <w:tc>
-          <w:tcPr/>
-          <w:p>
-            <w:pPr>
-              <w:pStyle w:val="Compact"/>
-              <w:jc w:val="left"/>
-            </w:pPr>
-            <w:r>
-              <w:t xml:space="preserve">3</w:t>
-            </w:r>
-          </w:p>
-        </w:tc>
-        <w:tc>
-          <w:tcPr/>
-          <w:p>
-            <w:pPr>
-              <w:pStyle w:val="Compact"/>
-              <w:jc w:val="left"/>
-            </w:pPr>
-            <w:r>
-              <w:t xml:space="preserve">Open</w:t>
+              <w:t xml:space="preserve">Confirmed</w:t>
             </w:r>
           </w:p>
         </w:tc>
@@ -1414,12 +1438,48 @@
       <w:pPr>
         <w:numPr>
           <w:ilvl w:val="0"/>
-          <w:numId w:val="1003"/>
+          <w:numId w:val="1004"/>
         </w:numPr>
         <w:pStyle w:val="Compact"/>
       </w:pPr>
       <w:r>
         <w:t xml:space="preserve">Proposals sent per month: Business has no monthly cap but keeps spam and rate limits. Matches stay visible when the allowance runs out.</w:t>
+      </w:r>
+    </w:p>
+    <w:p>
+      <w:pPr>
+        <w:numPr>
+          <w:ilvl w:val="0"/>
+          <w:numId w:val="1004"/>
+        </w:numPr>
+        <w:pStyle w:val="Compact"/>
+      </w:pPr>
+      <w:r>
+        <w:t xml:space="preserve">Published services at one time: Question 1: original 1/3/10 or revised 3/5/10. Revised shown (recommended).</w:t>
+      </w:r>
+    </w:p>
+    <w:p>
+      <w:pPr>
+        <w:numPr>
+          <w:ilvl w:val="0"/>
+          <w:numId w:val="1004"/>
+        </w:numPr>
+        <w:pStyle w:val="Compact"/>
+      </w:pPr>
+      <w:r>
+        <w:t xml:space="preserve">Approved pitches to attorneys per month: Separate from the proposal allowance.</w:t>
+      </w:r>
+    </w:p>
+    <w:p>
+      <w:pPr>
+        <w:numPr>
+          <w:ilvl w:val="0"/>
+          <w:numId w:val="1004"/>
+        </w:numPr>
+        <w:pStyle w:val="Compact"/>
+      </w:pPr>
+      <w:r>
+        <w:t xml:space="preserve">Agency team seats included: Business includes three seats, owner included. Extra seats are $15 a month each.</w:t>
       </w:r>
     </w:p>
     <w:bookmarkEnd w:id="22"/>
@@ -1546,7 +1606,7 @@
               <w:jc w:val="left"/>
             </w:pPr>
             <w:r>
-              <w:t xml:space="preserve">DELA AI help per month on Lawfecta’s key (per month)</w:t>
+              <w:t xml:space="preserve">Weighted AI credits per month on Lawfecta’s key (per month)</w:t>
             </w:r>
           </w:p>
         </w:tc>
@@ -1804,18 +1864,6 @@
               <w:jc w:val="left"/>
             </w:pPr>
             <w:r>
-              <w:t xml:space="preserve">0</w:t>
-            </w:r>
-          </w:p>
-        </w:tc>
-        <w:tc>
-          <w:tcPr/>
-          <w:p>
-            <w:pPr>
-              <w:pStyle w:val="Compact"/>
-              <w:jc w:val="left"/>
-            </w:pPr>
-            <w:r>
               <w:t xml:space="preserve">1</w:t>
             </w:r>
           </w:p>
@@ -1828,7 +1876,19 @@
               <w:jc w:val="left"/>
             </w:pPr>
             <w:r>
-              <w:t xml:space="preserve">3</w:t>
+              <w:t xml:space="preserve">2</w:t>
+            </w:r>
+          </w:p>
+        </w:tc>
+        <w:tc>
+          <w:tcPr/>
+          <w:p>
+            <w:pPr>
+              <w:pStyle w:val="Compact"/>
+              <w:jc w:val="left"/>
+            </w:pPr>
+            <w:r>
+              <w:t xml:space="preserve">5</w:t>
             </w:r>
           </w:p>
         </w:tc>
@@ -1852,7 +1912,7 @@
               <w:jc w:val="left"/>
             </w:pPr>
             <w:r>
-              <w:t xml:space="preserve">Open</w:t>
+              <w:t xml:space="preserve">Confirmed</w:t>
             </w:r>
           </w:p>
         </w:tc>
@@ -2034,19 +2094,19 @@
       <w:pPr>
         <w:numPr>
           <w:ilvl w:val="0"/>
-          <w:numId w:val="1004"/>
+          <w:numId w:val="1005"/>
         </w:numPr>
         <w:pStyle w:val="Compact"/>
       </w:pPr>
       <w:r>
-        <w:t xml:space="preserve">DELA AI help per month on Lawfecta’s key: Runs on the member’s own key do not count here, but still have safety limits.</w:t>
+        <w:t xml:space="preserve">Weighted AI credits per month on Lawfecta’s key: Provisional until costs are validated. Credits are weighted by AI cost; they are not a number of playbooks or conversations. Calls on the member’s own key do not use credits.</w:t>
       </w:r>
     </w:p>
     <w:p>
       <w:pPr>
         <w:numPr>
           <w:ilvl w:val="0"/>
-          <w:numId w:val="1004"/>
+          <w:numId w:val="1005"/>
         </w:numPr>
         <w:pStyle w:val="Compact"/>
       </w:pPr>
@@ -2351,6 +2411,64 @@
               <w:jc w:val="left"/>
             </w:pPr>
             <w:r>
+              <w:t xml:space="preserve">Confirmed</w:t>
+            </w:r>
+          </w:p>
+        </w:tc>
+        <w:tc>
+          <w:tcPr/>
+          <w:p>
+            <w:pPr>
+              <w:pStyle w:val="Compact"/>
+              <w:jc w:val="left"/>
+            </w:pPr>
+            <w:r>
+              <w:t xml:space="preserve">Stacey, Decision Register v1.1 (2026-10-26)</w:t>
+            </w:r>
+          </w:p>
+        </w:tc>
+        <w:tc>
+          <w:tcPr/>
+          <w:p>
+            <w:pPr>
+              <w:pStyle w:val="Compact"/>
+            </w:pPr>
+          </w:p>
+        </w:tc>
+      </w:tr>
+      <w:tr>
+        <w:tc>
+          <w:tcPr/>
+          <w:p>
+            <w:pPr>
+              <w:pStyle w:val="Compact"/>
+              <w:jc w:val="left"/>
+            </w:pPr>
+            <w:r>
+              <w:t xml:space="preserve">Longest fixed-fee engagement</w:t>
+            </w:r>
+          </w:p>
+        </w:tc>
+        <w:tc>
+          <w:tcPr/>
+          <w:p>
+            <w:pPr>
+              <w:pStyle w:val="Compact"/>
+              <w:jc w:val="left"/>
+            </w:pPr>
+            <w:r>
+              <w:t xml:space="preserve">90 days</w:t>
+            </w:r>
+          </w:p>
+        </w:tc>
+        <w:tc>
+          <w:tcPr/>
+          <w:p>
+            <w:pPr>
+              <w:pStyle w:val="Compact"/>
+              <w:jc w:val="left"/>
+            </w:pPr>
+            <w:r>
               <w:t xml:space="preserve">Open</w:t>
             </w:r>
           </w:p>
@@ -2363,65 +2481,7 @@
               <w:jc w:val="left"/>
             </w:pPr>
             <w:r>
-              <w:t xml:space="preserve">O-02, reopened</w:t>
-            </w:r>
-          </w:p>
-        </w:tc>
-        <w:tc>
-          <w:tcPr/>
-          <w:p>
-            <w:pPr>
-              <w:pStyle w:val="Compact"/>
-            </w:pPr>
-          </w:p>
-        </w:tc>
-      </w:tr>
-      <w:tr>
-        <w:tc>
-          <w:tcPr/>
-          <w:p>
-            <w:pPr>
-              <w:pStyle w:val="Compact"/>
-              <w:jc w:val="left"/>
-            </w:pPr>
-            <w:r>
-              <w:t xml:space="preserve">Longest fixed-fee engagement</w:t>
-            </w:r>
-          </w:p>
-        </w:tc>
-        <w:tc>
-          <w:tcPr/>
-          <w:p>
-            <w:pPr>
-              <w:pStyle w:val="Compact"/>
-              <w:jc w:val="left"/>
-            </w:pPr>
-            <w:r>
-              <w:t xml:space="preserve">90 days</w:t>
-            </w:r>
-          </w:p>
-        </w:tc>
-        <w:tc>
-          <w:tcPr/>
-          <w:p>
-            <w:pPr>
-              <w:pStyle w:val="Compact"/>
-              <w:jc w:val="left"/>
-            </w:pPr>
-            <w:r>
-              <w:t xml:space="preserve">Open</w:t>
-            </w:r>
-          </w:p>
-        </w:tc>
-        <w:tc>
-          <w:tcPr/>
-          <w:p>
-            <w:pPr>
-              <w:pStyle w:val="Compact"/>
-              <w:jc w:val="left"/>
-            </w:pPr>
-            <w:r>
-              <w:t xml:space="preserve">O-02, reopened</w:t>
+              <w:t xml:space="preserve">Decision Register v1.1, question 2 (90 days recommended)</w:t>
             </w:r>
           </w:p>
         </w:tc>
@@ -2789,19 +2849,19 @@
               <w:jc w:val="left"/>
             </w:pPr>
             <w:r>
-              <w:t xml:space="preserve">Suggested</w:t>
-            </w:r>
-          </w:p>
-        </w:tc>
-        <w:tc>
-          <w:tcPr/>
-          <w:p>
-            <w:pPr>
-              <w:pStyle w:val="Compact"/>
-              <w:jc w:val="left"/>
-            </w:pPr>
-            <w:r>
-              <w:t xml:space="preserve">1A section 8</w:t>
+              <w:t xml:space="preserve">Confirmed</w:t>
+            </w:r>
+          </w:p>
+        </w:tc>
+        <w:tc>
+          <w:tcPr/>
+          <w:p>
+            <w:pPr>
+              <w:pStyle w:val="Compact"/>
+              <w:jc w:val="left"/>
+            </w:pPr>
+            <w:r>
+              <w:t xml:space="preserve">Stacey, Decision Register v1.1 (2026-10-26)</w:t>
             </w:r>
           </w:p>
         </w:tc>
@@ -2847,6 +2907,122 @@
               <w:jc w:val="left"/>
             </w:pPr>
             <w:r>
+              <w:t xml:space="preserve">Confirmed</w:t>
+            </w:r>
+          </w:p>
+        </w:tc>
+        <w:tc>
+          <w:tcPr/>
+          <w:p>
+            <w:pPr>
+              <w:pStyle w:val="Compact"/>
+              <w:jc w:val="left"/>
+            </w:pPr>
+            <w:r>
+              <w:t xml:space="preserve">Stacey, Decision Register v1.1 (2026-10-26)</w:t>
+            </w:r>
+          </w:p>
+        </w:tc>
+        <w:tc>
+          <w:tcPr/>
+          <w:p>
+            <w:pPr>
+              <w:pStyle w:val="Compact"/>
+            </w:pPr>
+          </w:p>
+        </w:tc>
+      </w:tr>
+      <w:tr>
+        <w:tc>
+          <w:tcPr/>
+          <w:p>
+            <w:pPr>
+              <w:pStyle w:val="Compact"/>
+              <w:jc w:val="left"/>
+            </w:pPr>
+            <w:r>
+              <w:t xml:space="preserve">When the trial starts. New registrations only, one trial per member. When it ends, trial-only extras stop and the member keeps their data and active work.</w:t>
+            </w:r>
+          </w:p>
+        </w:tc>
+        <w:tc>
+          <w:tcPr/>
+          <w:p>
+            <w:pPr>
+              <w:pStyle w:val="Compact"/>
+              <w:jc w:val="left"/>
+            </w:pPr>
+            <w:r>
+              <w:t xml:space="preserve">registration</w:t>
+            </w:r>
+          </w:p>
+        </w:tc>
+        <w:tc>
+          <w:tcPr/>
+          <w:p>
+            <w:pPr>
+              <w:pStyle w:val="Compact"/>
+              <w:jc w:val="left"/>
+            </w:pPr>
+            <w:r>
+              <w:t xml:space="preserve">Confirmed</w:t>
+            </w:r>
+          </w:p>
+        </w:tc>
+        <w:tc>
+          <w:tcPr/>
+          <w:p>
+            <w:pPr>
+              <w:pStyle w:val="Compact"/>
+              <w:jc w:val="left"/>
+            </w:pPr>
+            <w:r>
+              <w:t xml:space="preserve">Stacey, Decision Register v1.1 (2026-10-26)</w:t>
+            </w:r>
+          </w:p>
+        </w:tc>
+        <w:tc>
+          <w:tcPr/>
+          <w:p>
+            <w:pPr>
+              <w:pStyle w:val="Compact"/>
+            </w:pPr>
+          </w:p>
+        </w:tc>
+      </w:tr>
+      <w:tr>
+        <w:tc>
+          <w:tcPr/>
+          <w:p>
+            <w:pPr>
+              <w:pStyle w:val="Compact"/>
+              <w:jc w:val="left"/>
+            </w:pPr>
+            <w:r>
+              <w:t xml:space="preserve">Trials go to members who register on or after. Members who registered before this date do not get a trial.</w:t>
+            </w:r>
+          </w:p>
+        </w:tc>
+        <w:tc>
+          <w:tcPr/>
+          <w:p>
+            <w:pPr>
+              <w:pStyle w:val="Compact"/>
+              <w:jc w:val="left"/>
+            </w:pPr>
+            <w:r>
+              <w:t xml:space="preserve">2026-11-01</w:t>
+            </w:r>
+          </w:p>
+        </w:tc>
+        <w:tc>
+          <w:tcPr/>
+          <w:p>
+            <w:pPr>
+              <w:pStyle w:val="Compact"/>
+              <w:jc w:val="left"/>
+            </w:pPr>
+            <w:r>
               <w:t xml:space="preserve">Open</w:t>
             </w:r>
           </w:p>
@@ -2859,41 +3035,41 @@
               <w:jc w:val="left"/>
             </w:pPr>
             <w:r>
-              <w:t xml:space="preserve">Suggestion by Claude</w:t>
-            </w:r>
-          </w:p>
-        </w:tc>
-        <w:tc>
-          <w:tcPr/>
-          <w:p>
-            <w:pPr>
-              <w:pStyle w:val="Compact"/>
-            </w:pPr>
-          </w:p>
-        </w:tc>
-      </w:tr>
-      <w:tr>
-        <w:tc>
-          <w:tcPr/>
-          <w:p>
-            <w:pPr>
-              <w:pStyle w:val="Compact"/>
-              <w:jc w:val="left"/>
-            </w:pPr>
-            <w:r>
-              <w:t xml:space="preserve">When the trial starts. No card needed. Ends on its own.</w:t>
-            </w:r>
-          </w:p>
-        </w:tc>
-        <w:tc>
-          <w:tcPr/>
-          <w:p>
-            <w:pPr>
-              <w:pStyle w:val="Compact"/>
-              <w:jc w:val="left"/>
-            </w:pPr>
-            <w:r>
-              <w:t xml:space="preserve">first dela login</w:t>
+              <w:t xml:space="preserve">Decision Register v1.1 says new registrations only; the start date is a suggestion by Claude</w:t>
+            </w:r>
+          </w:p>
+        </w:tc>
+        <w:tc>
+          <w:tcPr/>
+          <w:p>
+            <w:pPr>
+              <w:pStyle w:val="Compact"/>
+            </w:pPr>
+          </w:p>
+        </w:tc>
+      </w:tr>
+      <w:tr>
+        <w:tc>
+          <w:tcPr/>
+          <w:p>
+            <w:pPr>
+              <w:pStyle w:val="Compact"/>
+              <w:jc w:val="left"/>
+            </w:pPr>
+            <w:r>
+              <w:t xml:space="preserve">Monthly allowances reset on</w:t>
+            </w:r>
+          </w:p>
+        </w:tc>
+        <w:tc>
+          <w:tcPr/>
+          <w:p>
+            <w:pPr>
+              <w:pStyle w:val="Compact"/>
+              <w:jc w:val="left"/>
+            </w:pPr>
+            <w:r>
+              <w:t xml:space="preserve">calendar month</w:t>
             </w:r>
           </w:p>
         </w:tc>
@@ -2917,41 +3093,41 @@
               <w:jc w:val="left"/>
             </w:pPr>
             <w:r>
-              <w:t xml:space="preserve">O-01; suggestion by Claude</w:t>
-            </w:r>
-          </w:p>
-        </w:tc>
-        <w:tc>
-          <w:tcPr/>
-          <w:p>
-            <w:pPr>
-              <w:pStyle w:val="Compact"/>
-            </w:pPr>
-          </w:p>
-        </w:tc>
-      </w:tr>
-      <w:tr>
-        <w:tc>
-          <w:tcPr/>
-          <w:p>
-            <w:pPr>
-              <w:pStyle w:val="Compact"/>
-              <w:jc w:val="left"/>
-            </w:pPr>
-            <w:r>
-              <w:t xml:space="preserve">Monthly allowances reset on</w:t>
-            </w:r>
-          </w:p>
-        </w:tc>
-        <w:tc>
-          <w:tcPr/>
-          <w:p>
-            <w:pPr>
-              <w:pStyle w:val="Compact"/>
-              <w:jc w:val="left"/>
-            </w:pPr>
-            <w:r>
-              <w:t xml:space="preserve">calendar month</w:t>
+              <w:t xml:space="preserve">O-10; suggestion by Claude</w:t>
+            </w:r>
+          </w:p>
+        </w:tc>
+        <w:tc>
+          <w:tcPr/>
+          <w:p>
+            <w:pPr>
+              <w:pStyle w:val="Compact"/>
+            </w:pPr>
+          </w:p>
+        </w:tc>
+      </w:tr>
+      <w:tr>
+        <w:tc>
+          <w:tcPr/>
+          <w:p>
+            <w:pPr>
+              <w:pStyle w:val="Compact"/>
+              <w:jc w:val="left"/>
+            </w:pPr>
+            <w:r>
+              <w:t xml:space="preserve">Time zone for resets and deadlines</w:t>
+            </w:r>
+          </w:p>
+        </w:tc>
+        <w:tc>
+          <w:tcPr/>
+          <w:p>
+            <w:pPr>
+              <w:pStyle w:val="Compact"/>
+              <w:jc w:val="left"/>
+            </w:pPr>
+            <w:r>
+              <w:t xml:space="preserve">America/Los Angeles</w:t>
             </w:r>
           </w:p>
         </w:tc>
@@ -2975,6 +3151,64 @@
               <w:jc w:val="left"/>
             </w:pPr>
             <w:r>
+              <w:t xml:space="preserve">O-10; Claude guessed Pacific time. Please confirm Lawfecta’s time zone.</w:t>
+            </w:r>
+          </w:p>
+        </w:tc>
+        <w:tc>
+          <w:tcPr/>
+          <w:p>
+            <w:pPr>
+              <w:pStyle w:val="Compact"/>
+            </w:pPr>
+          </w:p>
+        </w:tc>
+      </w:tr>
+      <w:tr>
+        <w:tc>
+          <w:tcPr/>
+          <w:p>
+            <w:pPr>
+              <w:pStyle w:val="Compact"/>
+              <w:jc w:val="left"/>
+            </w:pPr>
+            <w:r>
+              <w:t xml:space="preserve">Do proposals to an attorney’s direct invitation use the allowance?. Free answers to invitations encourage fast replies.</w:t>
+            </w:r>
+          </w:p>
+        </w:tc>
+        <w:tc>
+          <w:tcPr/>
+          <w:p>
+            <w:pPr>
+              <w:pStyle w:val="Compact"/>
+              <w:jc w:val="left"/>
+            </w:pPr>
+            <w:r>
+              <w:t xml:space="preserve">No</w:t>
+            </w:r>
+          </w:p>
+        </w:tc>
+        <w:tc>
+          <w:tcPr/>
+          <w:p>
+            <w:pPr>
+              <w:pStyle w:val="Compact"/>
+              <w:jc w:val="left"/>
+            </w:pPr>
+            <w:r>
+              <w:t xml:space="preserve">Open</w:t>
+            </w:r>
+          </w:p>
+        </w:tc>
+        <w:tc>
+          <w:tcPr/>
+          <w:p>
+            <w:pPr>
+              <w:pStyle w:val="Compact"/>
+              <w:jc w:val="left"/>
+            </w:pPr>
+            <w:r>
               <w:t xml:space="preserve">O-10; suggestion by Claude</w:t>
             </w:r>
           </w:p>
@@ -2997,19 +3231,19 @@
               <w:jc w:val="left"/>
             </w:pPr>
             <w:r>
-              <w:t xml:space="preserve">Time zone for resets and deadlines</w:t>
-            </w:r>
-          </w:p>
-        </w:tc>
-        <w:tc>
-          <w:tcPr/>
-          <w:p>
-            <w:pPr>
-              <w:pStyle w:val="Compact"/>
-              <w:jc w:val="left"/>
-            </w:pPr>
-            <w:r>
-              <w:t xml:space="preserve">America/Los Angeles</w:t>
+              <w:t xml:space="preserve">When a withdrawn proposal gives the allowance back</w:t>
+            </w:r>
+          </w:p>
+        </w:tc>
+        <w:tc>
+          <w:tcPr/>
+          <w:p>
+            <w:pPr>
+              <w:pStyle w:val="Compact"/>
+              <w:jc w:val="left"/>
+            </w:pPr>
+            <w:r>
+              <w:t xml:space="preserve">only if gig canceled or materially changed</w:t>
             </w:r>
           </w:p>
         </w:tc>
@@ -3033,29 +3267,29 @@
               <w:jc w:val="left"/>
             </w:pPr>
             <w:r>
-              <w:t xml:space="preserve">O-10; Claude guessed Pacific time. Please confirm Lawfecta’s time zone.</w:t>
-            </w:r>
-          </w:p>
-        </w:tc>
-        <w:tc>
-          <w:tcPr/>
-          <w:p>
-            <w:pPr>
-              <w:pStyle w:val="Compact"/>
-            </w:pPr>
-          </w:p>
-        </w:tc>
-      </w:tr>
-      <w:tr>
-        <w:tc>
-          <w:tcPr/>
-          <w:p>
-            <w:pPr>
-              <w:pStyle w:val="Compact"/>
-              <w:jc w:val="left"/>
-            </w:pPr>
-            <w:r>
-              <w:t xml:space="preserve">Do proposals to an attorney’s direct invitation use the allowance?. Free answers to invitations encourage fast replies.</w:t>
+              <w:t xml:space="preserve">O-10; suggestion by Claude</w:t>
+            </w:r>
+          </w:p>
+        </w:tc>
+        <w:tc>
+          <w:tcPr/>
+          <w:p>
+            <w:pPr>
+              <w:pStyle w:val="Compact"/>
+            </w:pPr>
+          </w:p>
+        </w:tc>
+      </w:tr>
+      <w:tr>
+        <w:tc>
+          <w:tcPr/>
+          <w:p>
+            <w:pPr>
+              <w:pStyle w:val="Compact"/>
+              <w:jc w:val="left"/>
+            </w:pPr>
+            <w:r>
+              <w:t xml:space="preserve">Buying extra AI credits</w:t>
             </w:r>
           </w:p>
         </w:tc>
@@ -3079,6 +3313,122 @@
               <w:jc w:val="left"/>
             </w:pPr>
             <w:r>
+              <w:t xml:space="preserve">Confirmed</w:t>
+            </w:r>
+          </w:p>
+        </w:tc>
+        <w:tc>
+          <w:tcPr/>
+          <w:p>
+            <w:pPr>
+              <w:pStyle w:val="Compact"/>
+              <w:jc w:val="left"/>
+            </w:pPr>
+            <w:r>
+              <w:t xml:space="preserve">C-28</w:t>
+            </w:r>
+          </w:p>
+        </w:tc>
+        <w:tc>
+          <w:tcPr/>
+          <w:p>
+            <w:pPr>
+              <w:pStyle w:val="Compact"/>
+            </w:pPr>
+          </w:p>
+        </w:tc>
+      </w:tr>
+      <w:tr>
+        <w:tc>
+          <w:tcPr/>
+          <w:p>
+            <w:pPr>
+              <w:pStyle w:val="Compact"/>
+              <w:jc w:val="left"/>
+            </w:pPr>
+            <w:r>
+              <w:t xml:space="preserve">Buying extra proposals. Later only.</w:t>
+            </w:r>
+          </w:p>
+        </w:tc>
+        <w:tc>
+          <w:tcPr/>
+          <w:p>
+            <w:pPr>
+              <w:pStyle w:val="Compact"/>
+              <w:jc w:val="left"/>
+            </w:pPr>
+            <w:r>
+              <w:t xml:space="preserve">No</w:t>
+            </w:r>
+          </w:p>
+        </w:tc>
+        <w:tc>
+          <w:tcPr/>
+          <w:p>
+            <w:pPr>
+              <w:pStyle w:val="Compact"/>
+              <w:jc w:val="left"/>
+            </w:pPr>
+            <w:r>
+              <w:t xml:space="preserve">Confirmed</w:t>
+            </w:r>
+          </w:p>
+        </w:tc>
+        <w:tc>
+          <w:tcPr/>
+          <w:p>
+            <w:pPr>
+              <w:pStyle w:val="Compact"/>
+              <w:jc w:val="left"/>
+            </w:pPr>
+            <w:r>
+              <w:t xml:space="preserve">C-10</w:t>
+            </w:r>
+          </w:p>
+        </w:tc>
+        <w:tc>
+          <w:tcPr/>
+          <w:p>
+            <w:pPr>
+              <w:pStyle w:val="Compact"/>
+            </w:pPr>
+          </w:p>
+        </w:tc>
+      </w:tr>
+      <w:tr>
+        <w:tc>
+          <w:tcPr/>
+          <w:p>
+            <w:pPr>
+              <w:pStyle w:val="Compact"/>
+              <w:jc w:val="left"/>
+            </w:pPr>
+            <w:r>
+              <w:t xml:space="preserve">Price of one standalone export</w:t>
+            </w:r>
+          </w:p>
+        </w:tc>
+        <w:tc>
+          <w:tcPr/>
+          <w:p>
+            <w:pPr>
+              <w:pStyle w:val="Compact"/>
+              <w:jc w:val="left"/>
+            </w:pPr>
+            <w:r>
+              <w:t xml:space="preserve">$9</w:t>
+            </w:r>
+          </w:p>
+        </w:tc>
+        <w:tc>
+          <w:tcPr/>
+          <w:p>
+            <w:pPr>
+              <w:pStyle w:val="Compact"/>
+              <w:jc w:val="left"/>
+            </w:pPr>
+            <w:r>
               <w:t xml:space="preserve">Open</w:t>
             </w:r>
           </w:p>
@@ -3091,99 +3441,41 @@
               <w:jc w:val="left"/>
             </w:pPr>
             <w:r>
-              <w:t xml:space="preserve">O-10; suggestion by Claude</w:t>
-            </w:r>
-          </w:p>
-        </w:tc>
-        <w:tc>
-          <w:tcPr/>
-          <w:p>
-            <w:pPr>
-              <w:pStyle w:val="Compact"/>
-            </w:pPr>
-          </w:p>
-        </w:tc>
-      </w:tr>
-      <w:tr>
-        <w:tc>
-          <w:tcPr/>
-          <w:p>
-            <w:pPr>
-              <w:pStyle w:val="Compact"/>
-              <w:jc w:val="left"/>
-            </w:pPr>
-            <w:r>
-              <w:t xml:space="preserve">When a withdrawn proposal gives the allowance back</w:t>
-            </w:r>
-          </w:p>
-        </w:tc>
-        <w:tc>
-          <w:tcPr/>
-          <w:p>
-            <w:pPr>
-              <w:pStyle w:val="Compact"/>
-              <w:jc w:val="left"/>
-            </w:pPr>
-            <w:r>
-              <w:t xml:space="preserve">only if gig canceled or materially changed</w:t>
-            </w:r>
-          </w:p>
-        </w:tc>
-        <w:tc>
-          <w:tcPr/>
-          <w:p>
-            <w:pPr>
-              <w:pStyle w:val="Compact"/>
-              <w:jc w:val="left"/>
-            </w:pPr>
-            <w:r>
-              <w:t xml:space="preserve">Open</w:t>
-            </w:r>
-          </w:p>
-        </w:tc>
-        <w:tc>
-          <w:tcPr/>
-          <w:p>
-            <w:pPr>
-              <w:pStyle w:val="Compact"/>
-              <w:jc w:val="left"/>
-            </w:pPr>
-            <w:r>
-              <w:t xml:space="preserve">O-10; suggestion by Claude</w:t>
-            </w:r>
-          </w:p>
-        </w:tc>
-        <w:tc>
-          <w:tcPr/>
-          <w:p>
-            <w:pPr>
-              <w:pStyle w:val="Compact"/>
-            </w:pPr>
-          </w:p>
-        </w:tc>
-      </w:tr>
-      <w:tr>
-        <w:tc>
-          <w:tcPr/>
-          <w:p>
-            <w:pPr>
-              <w:pStyle w:val="Compact"/>
-              <w:jc w:val="left"/>
-            </w:pPr>
-            <w:r>
-              <w:t xml:space="preserve">Buying extra AI credits</w:t>
-            </w:r>
-          </w:p>
-        </w:tc>
-        <w:tc>
-          <w:tcPr/>
-          <w:p>
-            <w:pPr>
-              <w:pStyle w:val="Compact"/>
-              <w:jc w:val="left"/>
-            </w:pPr>
-            <w:r>
-              <w:t xml:space="preserve">No</w:t>
+              <w:t xml:space="preserve">C-28; price is a suggestion by Claude</w:t>
+            </w:r>
+          </w:p>
+        </w:tc>
+        <w:tc>
+          <w:tcPr/>
+          <w:p>
+            <w:pPr>
+              <w:pStyle w:val="Compact"/>
+            </w:pPr>
+          </w:p>
+        </w:tc>
+      </w:tr>
+      <w:tr>
+        <w:tc>
+          <w:tcPr/>
+          <w:p>
+            <w:pPr>
+              <w:pStyle w:val="Compact"/>
+              <w:jc w:val="left"/>
+            </w:pPr>
+            <w:r>
+              <w:t xml:space="preserve">Extra team seat on Business, per month. Annual price for extra seats and whether seats add AI, storage or integration allowances are still open.</w:t>
+            </w:r>
+          </w:p>
+        </w:tc>
+        <w:tc>
+          <w:tcPr/>
+          <w:p>
+            <w:pPr>
+              <w:pStyle w:val="Compact"/>
+              <w:jc w:val="left"/>
+            </w:pPr>
+            <w:r>
+              <w:t xml:space="preserve">$15</w:t>
             </w:r>
           </w:p>
         </w:tc>
@@ -3207,181 +3499,7 @@
               <w:jc w:val="left"/>
             </w:pPr>
             <w:r>
-              <w:t xml:space="preserve">C-28</w:t>
-            </w:r>
-          </w:p>
-        </w:tc>
-        <w:tc>
-          <w:tcPr/>
-          <w:p>
-            <w:pPr>
-              <w:pStyle w:val="Compact"/>
-            </w:pPr>
-          </w:p>
-        </w:tc>
-      </w:tr>
-      <w:tr>
-        <w:tc>
-          <w:tcPr/>
-          <w:p>
-            <w:pPr>
-              <w:pStyle w:val="Compact"/>
-              <w:jc w:val="left"/>
-            </w:pPr>
-            <w:r>
-              <w:t xml:space="preserve">Buying extra proposals. Later only.</w:t>
-            </w:r>
-          </w:p>
-        </w:tc>
-        <w:tc>
-          <w:tcPr/>
-          <w:p>
-            <w:pPr>
-              <w:pStyle w:val="Compact"/>
-              <w:jc w:val="left"/>
-            </w:pPr>
-            <w:r>
-              <w:t xml:space="preserve">No</w:t>
-            </w:r>
-          </w:p>
-        </w:tc>
-        <w:tc>
-          <w:tcPr/>
-          <w:p>
-            <w:pPr>
-              <w:pStyle w:val="Compact"/>
-              <w:jc w:val="left"/>
-            </w:pPr>
-            <w:r>
-              <w:t xml:space="preserve">Confirmed</w:t>
-            </w:r>
-          </w:p>
-        </w:tc>
-        <w:tc>
-          <w:tcPr/>
-          <w:p>
-            <w:pPr>
-              <w:pStyle w:val="Compact"/>
-              <w:jc w:val="left"/>
-            </w:pPr>
-            <w:r>
-              <w:t xml:space="preserve">C-10</w:t>
-            </w:r>
-          </w:p>
-        </w:tc>
-        <w:tc>
-          <w:tcPr/>
-          <w:p>
-            <w:pPr>
-              <w:pStyle w:val="Compact"/>
-            </w:pPr>
-          </w:p>
-        </w:tc>
-      </w:tr>
-      <w:tr>
-        <w:tc>
-          <w:tcPr/>
-          <w:p>
-            <w:pPr>
-              <w:pStyle w:val="Compact"/>
-              <w:jc w:val="left"/>
-            </w:pPr>
-            <w:r>
-              <w:t xml:space="preserve">Price of one standalone export</w:t>
-            </w:r>
-          </w:p>
-        </w:tc>
-        <w:tc>
-          <w:tcPr/>
-          <w:p>
-            <w:pPr>
-              <w:pStyle w:val="Compact"/>
-              <w:jc w:val="left"/>
-            </w:pPr>
-            <w:r>
-              <w:t xml:space="preserve">$9</w:t>
-            </w:r>
-          </w:p>
-        </w:tc>
-        <w:tc>
-          <w:tcPr/>
-          <w:p>
-            <w:pPr>
-              <w:pStyle w:val="Compact"/>
-              <w:jc w:val="left"/>
-            </w:pPr>
-            <w:r>
-              <w:t xml:space="preserve">Open</w:t>
-            </w:r>
-          </w:p>
-        </w:tc>
-        <w:tc>
-          <w:tcPr/>
-          <w:p>
-            <w:pPr>
-              <w:pStyle w:val="Compact"/>
-              <w:jc w:val="left"/>
-            </w:pPr>
-            <w:r>
-              <w:t xml:space="preserve">C-28; price is a suggestion by Claude</w:t>
-            </w:r>
-          </w:p>
-        </w:tc>
-        <w:tc>
-          <w:tcPr/>
-          <w:p>
-            <w:pPr>
-              <w:pStyle w:val="Compact"/>
-            </w:pPr>
-          </w:p>
-        </w:tc>
-      </w:tr>
-      <w:tr>
-        <w:tc>
-          <w:tcPr/>
-          <w:p>
-            <w:pPr>
-              <w:pStyle w:val="Compact"/>
-              <w:jc w:val="left"/>
-            </w:pPr>
-            <w:r>
-              <w:t xml:space="preserve">Extra team seat on Business, per month</w:t>
-            </w:r>
-          </w:p>
-        </w:tc>
-        <w:tc>
-          <w:tcPr/>
-          <w:p>
-            <w:pPr>
-              <w:pStyle w:val="Compact"/>
-              <w:jc w:val="left"/>
-            </w:pPr>
-            <w:r>
-              <w:t xml:space="preserve">$15</w:t>
-            </w:r>
-          </w:p>
-        </w:tc>
-        <w:tc>
-          <w:tcPr/>
-          <w:p>
-            <w:pPr>
-              <w:pStyle w:val="Compact"/>
-              <w:jc w:val="left"/>
-            </w:pPr>
-            <w:r>
-              <w:t xml:space="preserve">Open</w:t>
-            </w:r>
-          </w:p>
-        </w:tc>
-        <w:tc>
-          <w:tcPr/>
-          <w:p>
-            <w:pPr>
-              <w:pStyle w:val="Compact"/>
-              <w:jc w:val="left"/>
-            </w:pPr>
-            <w:r>
-              <w:t xml:space="preserve">O-01; suggestion by Claude</w:t>
+              <w:t xml:space="preserve">Stacey, Decision Register v1.1 (2026-10-26)</w:t>
             </w:r>
           </w:p>
         </w:tc>
@@ -4141,7 +4259,7 @@
               <w:jc w:val="left"/>
             </w:pPr>
             <w:r>
-              <w:t xml:space="preserve">O-04</w:t>
+              <w:t xml:space="preserve">Decision Register v1.1, question 3 (A recommended)</w:t>
             </w:r>
           </w:p>
         </w:tc>
@@ -4199,7 +4317,7 @@
               <w:jc w:val="left"/>
             </w:pPr>
             <w:r>
-              <w:t xml:space="preserve">O-04; suggestion by Claude</w:t>
+              <w:t xml:space="preserve">Decision Register v1.1, question 4 (B recommended: one free review per milestone)</w:t>
             </w:r>
           </w:p>
         </w:tc>
@@ -4465,7 +4583,7 @@
               <w:jc w:val="left"/>
             </w:pPr>
             <w:r>
-              <w:t xml:space="preserve">2, 3</w:t>
+              <w:t xml:space="preserve">2, 5</w:t>
             </w:r>
           </w:p>
         </w:tc>
@@ -4489,7 +4607,7 @@
               <w:jc w:val="left"/>
             </w:pPr>
             <w:r>
-              <w:t xml:space="preserve">C-17 says over several days; spacing is a suggestion by Claude</w:t>
+              <w:t xml:space="preserve">Decision Register v1.1, question 5 (A recommended: day 2 and day 5)</w:t>
             </w:r>
           </w:p>
         </w:tc>
@@ -4547,7 +4665,7 @@
               <w:jc w:val="left"/>
             </w:pPr>
             <w:r>
-              <w:t xml:space="preserve">1A section 22; suggestion by Claude</w:t>
+              <w:t xml:space="preserve">Decision Register v1.1, question 5</w:t>
             </w:r>
           </w:p>
         </w:tc>
@@ -4581,7 +4699,7 @@
               <w:jc w:val="left"/>
             </w:pPr>
             <w:r>
-              <w:t xml:space="preserve">monthly deliverable</w:t>
+              <w:t xml:space="preserve">parties choose monthly or split</w:t>
             </w:r>
           </w:p>
         </w:tc>
@@ -4605,7 +4723,7 @@
               <w:jc w:val="left"/>
             </w:pPr>
             <w:r>
-              <w:t xml:space="preserve">1A section 22 open release decision</w:t>
+              <w:t xml:space="preserve">Decision Register v1.1, question 6 (C recommended)</w:t>
             </w:r>
           </w:p>
         </w:tc>
@@ -6849,6 +6967,9 @@
     <w:abstractNumId w:val="991"/>
   </w:num>
   <w:num w:numId="1004">
+    <w:abstractNumId w:val="991"/>
+  </w:num>
+  <w:num w:numId="1005">
     <w:abstractNumId w:val="991"/>
   </w:num>
 </w:numbering>

</xml_diff>